<commit_message>
docs: cap nhat huong dan than thien kem hinh anh thuc te thao tac
</commit_message>
<xml_diff>
--- a/docs/HUONG_DAN_GIAO_VIEN_NOP_BAI_WEB.docx
+++ b/docs/HUONG_DAN_GIAO_VIEN_NOP_BAI_WEB.docx
@@ -2,101 +2,6 @@
 <file path=word/document.xml><?xml version="1.0" encoding="utf-8"?>
 <w:document xmlns:wpc="http://schemas.microsoft.com/office/word/2010/wordprocessingCanvas" xmlns:mo="http://schemas.microsoft.com/office/mac/office/2008/main" xmlns:mc="http://schemas.openxmlformats.org/markup-compatibility/2006" xmlns:mv="urn:schemas-microsoft-com:mac:vml" xmlns:o="urn:schemas-microsoft-com:office:office" xmlns:r="http://schemas.openxmlformats.org/officeDocument/2006/relationships" xmlns:m="http://schemas.openxmlformats.org/officeDocument/2006/math" xmlns:v="urn:schemas-microsoft-com:vml" xmlns:wp14="http://schemas.microsoft.com/office/word/2010/wordprocessingDrawing" xmlns:wp="http://schemas.openxmlformats.org/drawingml/2006/wordprocessingDrawing" xmlns:w10="urn:schemas-microsoft-com:office:word" xmlns:w="http://schemas.openxmlformats.org/wordprocessingml/2006/main" xmlns:w14="http://schemas.microsoft.com/office/word/2010/wordml" xmlns:wpg="http://schemas.microsoft.com/office/word/2010/wordprocessingGroup" xmlns:wpi="http://schemas.microsoft.com/office/word/2010/wordprocessingInk" xmlns:wne="http://schemas.microsoft.com/office/word/2006/wordml" xmlns:wps="http://schemas.microsoft.com/office/word/2010/wordprocessingShape" mc:Ignorable="w14 wp14">
   <w:body>
-    <w:tbl>
-      <w:tblPr>
-        <w:tblW w:type="auto" w:w="0"/>
-        <w:jc w:val="center"/>
-        <w:tblLayout w:type="fixed"/>
-        <w:tblLook w:firstColumn="1" w:firstRow="1" w:lastColumn="0" w:lastRow="0" w:noHBand="0" w:noVBand="1" w:val="04A0"/>
-      </w:tblPr>
-      <w:tblGrid>
-        <w:gridCol w:w="4802"/>
-        <w:gridCol w:w="4802"/>
-      </w:tblGrid>
-      <w:tr>
-        <w:tc>
-          <w:tcPr>
-            <w:tcW w:type="dxa" w:w="5184"/>
-          </w:tcPr>
-          <w:p>
-            <w:pPr>
-              <w:jc w:val="center"/>
-            </w:pPr>
-            <w:r>
-              <w:rPr>
-                <w:rFonts w:ascii="Times New Roman" w:hAnsi="Times New Roman"/>
-                <w:sz w:val="20"/>
-              </w:rPr>
-              <w:t>SỞ GIÁO DỤC VÀ ĐÀO TẠO TP. HỒ CHÍ MINH</w:t>
-              <w:br/>
-            </w:r>
-            <w:r>
-              <w:rPr>
-                <w:rFonts w:ascii="Times New Roman" w:hAnsi="Times New Roman"/>
-                <w:b/>
-                <w:color w:val="0F3E6D"/>
-                <w:sz w:val="22"/>
-              </w:rPr>
-              <w:t>TRƯỜNG THPT MẠC ĐĨNH CHI</w:t>
-              <w:br/>
-            </w:r>
-            <w:r>
-              <w:rPr>
-                <w:rFonts w:ascii="Times New Roman" w:hAnsi="Times New Roman"/>
-                <w:b/>
-                <w:sz w:val="20"/>
-              </w:rPr>
-              <w:t>BAN TRUYỀN THÔNG</w:t>
-              <w:br/>
-              <w:t>───────────────</w:t>
-            </w:r>
-          </w:p>
-        </w:tc>
-        <w:tc>
-          <w:tcPr>
-            <w:tcW w:type="dxa" w:w="5184"/>
-          </w:tcPr>
-          <w:p>
-            <w:pPr>
-              <w:jc w:val="center"/>
-            </w:pPr>
-            <w:r>
-              <w:rPr>
-                <w:rFonts w:ascii="Times New Roman" w:hAnsi="Times New Roman"/>
-                <w:b/>
-                <w:sz w:val="21"/>
-              </w:rPr>
-              <w:t>CỘNG HÒA XÃ HỘI CHỦ NGHĨA VIỆT NAM</w:t>
-              <w:br/>
-            </w:r>
-            <w:r>
-              <w:rPr>
-                <w:rFonts w:ascii="Times New Roman" w:hAnsi="Times New Roman"/>
-                <w:b/>
-                <w:sz w:val="22"/>
-              </w:rPr>
-              <w:t>Độc lập – Tự do – Hạnh phúc</w:t>
-              <w:br/>
-            </w:r>
-            <w:r>
-              <w:rPr>
-                <w:rFonts w:ascii="Times New Roman" w:hAnsi="Times New Roman"/>
-                <w:i/>
-                <w:sz w:val="20"/>
-              </w:rPr>
-              <w:t>─────────────────</w:t>
-              <w:br/>
-              <w:t>TP. Hồ Chí Minh, năm học 2026 - 2027</w:t>
-            </w:r>
-          </w:p>
-        </w:tc>
-      </w:tr>
-    </w:tbl>
-    <w:p>
-      <w:pPr>
-        <w:spacing w:before="160" w:after="40"/>
-      </w:pPr>
-    </w:p>
     <w:p>
       <w:pPr>
         <w:spacing w:after="40"/>
@@ -104,19 +9,32 @@
       </w:pPr>
       <w:r>
         <w:rPr>
-          <w:rFonts w:ascii="Times New Roman" w:hAnsi="Times New Roman"/>
+          <w:rFonts w:ascii="Arial" w:hAnsi="Arial"/>
           <w:b/>
-          <w:color w:val="0F3E6D"/>
-          <w:sz w:val="30"/>
+          <w:color w:val="64748B"/>
+          <w:sz w:val="21"/>
         </w:rPr>
-        <w:t>SỔ TAY HƯỚNG DẪN</w:t>
-        <w:br/>
-        <w:t>NỘP BÀI TRUYỀN THÔNG TRỰC TUYẾN DÀNH CHO GIÁO VIÊN</w:t>
+        <w:t>TRƯỜNG THPT MẠC ĐĨNH CHI • BAN TRUYỀN THÔNG 2026 - 2027</w:t>
       </w:r>
     </w:p>
     <w:p>
       <w:pPr>
-        <w:spacing w:after="240"/>
+        <w:spacing w:before="40" w:after="40"/>
+        <w:jc w:val="center"/>
+      </w:pPr>
+      <w:r>
+        <w:rPr>
+          <w:rFonts w:ascii="Arial" w:hAnsi="Arial"/>
+          <w:b/>
+          <w:color w:val="0F3E6D"/>
+          <w:sz w:val="32"/>
+        </w:rPr>
+        <w:t>HƯỚNG DẪN THẦY/CÔ NỘP BÀI TRUYỀN THÔNG</w:t>
+      </w:r>
+    </w:p>
+    <w:p>
+      <w:pPr>
+        <w:spacing w:after="200"/>
         <w:jc w:val="center"/>
       </w:pPr>
       <w:r>
@@ -125,7 +43,44 @@
           <w:color w:val="64748B"/>
           <w:sz w:val="22"/>
         </w:rPr>
-        <w:t>(Hệ thống cổng tiếp nhận bài viết, hình ảnh &amp; video hoạt động của Tổ Chuyên môn &amp; CLB)</w:t>
+        <w:t>Cẩm nang bỏ túi 4 bước thao tác nhanh trên điện thoại hoặc máy tính</w:t>
+      </w:r>
+    </w:p>
+    <w:p>
+      <w:pPr>
+        <w:spacing w:after="120"/>
+      </w:pPr>
+      <w:r>
+        <w:rPr>
+          <w:b/>
+        </w:rPr>
+        <w:t>Kính gửi Quý Thầy/Cô đại diện các Tổ Chuyên môn và Câu Lạc Bộ,</w:t>
+        <w:br/>
+      </w:r>
+      <w:r>
+        <w:t>Để việc gửi bài viết, hình ảnh hoạt động về Ban Truyền Thông trở nên nhanh gọn nhất, nhà trường đã mở cổng tiếp nhận trực tuyến tại địa chỉ:</w:t>
+        <w:br/>
+      </w:r>
+    </w:p>
+    <w:p>
+      <w:pPr>
+        <w:spacing w:before="40" w:after="120"/>
+        <w:jc w:val="center"/>
+      </w:pPr>
+      <w:r>
+        <w:rPr>
+          <w:b/>
+          <w:color w:val="1A56DB"/>
+          <w:sz w:val="26"/>
+        </w:rPr>
+        <w:t>👉 https://bantruyenthong.pages.dev/</w:t>
+        <w:br/>
+      </w:r>
+      <w:r>
+        <w:rPr>
+          <w:i/>
+        </w:rPr>
+        <w:t>(Dùng được ngay trên điện thoại hoặc máy tính, KHÔNG CẦN đăng nhập Gmail)</w:t>
       </w:r>
     </w:p>
     <w:tbl>
@@ -145,12 +100,12 @@
             <w:tcMar>
               <w:top w:w="140" w:type="dxa"/>
               <w:bottom w:w="140" w:type="dxa"/>
-              <w:left w:w="200" w:type="dxa"/>
-              <w:right w:w="200" w:type="dxa"/>
+              <w:left w:w="180" w:type="dxa"/>
+              <w:right w:w="180" w:type="dxa"/>
             </w:tcMar>
             <w:tcBorders>
               <w:top w:val="none"/>
-              <w:left w:val="single" w:sz="36" w:space="0" w:color="16A34A"/>
+              <w:left w:val="single" w:sz="30" w:space="0" w:color="16A34A"/>
               <w:bottom w:val="none"/>
               <w:right w:val="none"/>
             </w:tcBorders>
@@ -161,12 +116,12 @@
             </w:pPr>
             <w:r>
               <w:rPr>
-                <w:rFonts w:ascii="Times New Roman" w:hAnsi="Times New Roman"/>
+                <w:rFonts w:ascii="Arial" w:hAnsi="Arial"/>
                 <w:b/>
                 <w:color w:val="0F3E6D"/>
-                <w:sz w:val="23"/>
+                <w:sz w:val="22"/>
               </w:rPr>
-              <w:t>💡 THÔNG TIN TRUY CẬP HỆ THỐNG NHANH</w:t>
+              <w:t>ƯU ĐIỂM CỦA HỆ THỐNG MỚI</w:t>
               <w:br/>
             </w:r>
           </w:p>
@@ -176,11 +131,11 @@
             </w:pPr>
             <w:r>
               <w:rPr>
-                <w:rFonts w:ascii="Times New Roman" w:hAnsi="Times New Roman"/>
-                <w:color w:val="1E293B"/>
-                <w:sz w:val="22"/>
+                <w:rFonts w:ascii="Arial" w:hAnsi="Arial"/>
+                <w:color w:val="334155"/>
+                <w:sz w:val="21"/>
               </w:rPr>
-              <w:t>🌐 Địa chỉ Website nộp bài: https://bantruyenthong.pages.dev/</w:t>
+              <w:t>✨ Thao tác cực nhanh: Chỉ mất từ 2 – 3 phút để gửi xong bài.</w:t>
             </w:r>
           </w:p>
           <w:p>
@@ -189,11 +144,11 @@
             </w:pPr>
             <w:r>
               <w:rPr>
-                <w:rFonts w:ascii="Times New Roman" w:hAnsi="Times New Roman"/>
-                <w:color w:val="1E293B"/>
-                <w:sz w:val="22"/>
+                <w:rFonts w:ascii="Arial" w:hAnsi="Arial"/>
+                <w:color w:val="334155"/>
+                <w:sz w:val="21"/>
               </w:rPr>
-              <w:t>📱 Thiết bị hỗ trợ: Dùng tốt trên cả Điện thoại di động (iOS/Android), Máy tính bảng, Laptop và PC.</w:t>
+              <w:t>✨ Tự động cấp mã bài (Ticket ID): Dạng TT-2026-XXXX để Thầy/Cô theo dõi tiến độ.</w:t>
             </w:r>
           </w:p>
           <w:p>
@@ -202,11 +157,11 @@
             </w:pPr>
             <w:r>
               <w:rPr>
-                <w:rFonts w:ascii="Times New Roman" w:hAnsi="Times New Roman"/>
-                <w:color w:val="1E293B"/>
-                <w:sz w:val="22"/>
+                <w:rFonts w:ascii="Arial" w:hAnsi="Arial"/>
+                <w:color w:val="334155"/>
+                <w:sz w:val="21"/>
               </w:rPr>
-              <w:t>🔑 Không cần đăng nhập Gmail: Thầy/Cô truy cập đường link là có thể gửi bài ngay.</w:t>
+              <w:t>✨ Nhận email biên nhận tự động ngay sau khi gửi bài thành công.</w:t>
             </w:r>
           </w:p>
           <w:p>
@@ -215,24 +170,11 @@
             </w:pPr>
             <w:r>
               <w:rPr>
-                <w:rFonts w:ascii="Times New Roman" w:hAnsi="Times New Roman"/>
-                <w:color w:val="1E293B"/>
-                <w:sz w:val="22"/>
+                <w:rFonts w:ascii="Arial" w:hAnsi="Arial"/>
+                <w:color w:val="334155"/>
+                <w:sz w:val="21"/>
               </w:rPr>
-              <w:t>🎫 Cấp mã Ticket tự động: Mỗi bài viết sẽ có mã riêng (ví dụ TT-2026-0012) kèm email biên nhận để theo dõi tiến độ.</w:t>
-            </w:r>
-          </w:p>
-          <w:p>
-            <w:pPr>
-              <w:spacing w:before="0" w:after="40" w:line="276" w:lineRule="auto"/>
-            </w:pPr>
-            <w:r>
-              <w:rPr>
-                <w:rFonts w:ascii="Times New Roman" w:hAnsi="Times New Roman"/>
-                <w:color w:val="1E293B"/>
-                <w:sz w:val="22"/>
-              </w:rPr>
-              <w:t>⚡ Tự động lưu trữ an toàn: Hình ảnh/video tự động đổ về thư mục Google Drive của trường và ghi log quản lý.</w:t>
+              <w:t>✨ Tải được cùng lúc nhiều ảnh gốc (tối đa 20 ảnh/video, lên đến 50MB mỗi tệp).</w:t>
             </w:r>
           </w:p>
         </w:tc>
@@ -240,297 +182,367 @@
     </w:tbl>
     <w:p>
       <w:pPr>
-        <w:spacing w:after="80"/>
+        <w:spacing w:before="0" w:after="80"/>
       </w:pPr>
     </w:p>
     <w:p>
       <w:pPr>
-        <w:spacing w:before="200" w:after="80"/>
+        <w:spacing w:before="240" w:after="80"/>
       </w:pPr>
       <w:r>
         <w:rPr>
+          <w:rFonts w:ascii="Arial" w:hAnsi="Arial"/>
           <w:b/>
-          <w:color w:val="0F3E6D"/>
-          <w:sz w:val="26"/>
+          <w:color w:val="C0392B"/>
+          <w:sz w:val="25"/>
         </w:rPr>
-        <w:t>I. CHUẨN BỊ TƯ LIỆU TRƯỚC KHI NỘP BÀI (TIẾT KIỆM THỜI GIAN)</w:t>
+        <w:t>BƯỚC 1: TRUY CẬP TRANG WEB VÀ CHỌN ĐỐI TƯỢNG NỘP BÀI</w:t>
       </w:r>
     </w:p>
     <w:p>
       <w:r>
-        <w:t>Để thao tác nộp bài diễn ra nhanh chóng (chỉ mất từ 2 – 3 phút), Thầy/Cô vui lòng chuẩn bị trước các thông tin sau:</w:t>
-      </w:r>
-    </w:p>
-    <w:p>
-      <w:pPr>
-        <w:pStyle w:val="ListBullet"/>
-        <w:spacing w:before="40" w:after="60"/>
-      </w:pPr>
-      <w:r>
-        <w:rPr>
-          <w:b/>
-          <w:color w:val="1E293B"/>
-        </w:rPr>
-        <w:t xml:space="preserve">1. Thông tin người đại diện: </w:t>
-      </w:r>
-      <w:r>
-        <w:t>Họ tên Thầy/Cô phụ trách, Số điện thoại (Zalo), Email chính xác để nhận thư biên nhận tự động.</w:t>
-      </w:r>
-    </w:p>
-    <w:p>
-      <w:pPr>
-        <w:pStyle w:val="ListBullet"/>
-        <w:spacing w:before="40" w:after="60"/>
-      </w:pPr>
-      <w:r>
-        <w:rPr>
-          <w:b/>
-          <w:color w:val="1E293B"/>
-        </w:rPr>
-        <w:t xml:space="preserve">2. Nội dung bài viết (Caption đề xuất): </w:t>
-      </w:r>
-      <w:r>
-        <w:t>Soạn thảo sẵn trên Word hoặc Note điện thoại theo quy chuẩn 5W+1H (Ai, Hoạt động gì, Khi nào, Ở đâu, Ý nghĩa giáo dục &amp; Kết quả nổi bật). Vui lòng kiểm tra chính xác họ tên Thầy/Cô bồi dưỡng, học sinh đạt giải; tránh viết tắt; không sử dụng tiếng lóng hoặc lạm dụng AI.</w:t>
-      </w:r>
-    </w:p>
-    <w:p>
-      <w:pPr>
-        <w:pStyle w:val="ListBullet"/>
-        <w:spacing w:before="40" w:after="60"/>
-      </w:pPr>
-      <w:r>
-        <w:rPr>
-          <w:b/>
-          <w:color w:val="1E293B"/>
-        </w:rPr>
-        <w:t xml:space="preserve">3. Hình ảnh &amp; Video tư liệu gốc: </w:t>
-      </w:r>
-      <w:r>
-        <w:t>Lựa chọn từ 5 – 15 bức ảnh đẹp nhất (ưu tiên ảnh chụp ngang tỉ lệ 16:9 hoặc 4:3, sắc nét, rõ mặt đại biểu và học sinh, góc máy trang trọng). Nếu có video dung lượng lớn (hàng trăm MB - hàng GB), Thầy/Cô chỉ cần tải sẵn lên Google Drive cá nhân và lấy link chia sẻ.</w:t>
-      </w:r>
-    </w:p>
-    <w:p>
-      <w:pPr>
-        <w:spacing w:before="280" w:after="80"/>
-      </w:pPr>
-      <w:r>
-        <w:rPr>
-          <w:b/>
-          <w:color w:val="0F3E6D"/>
-          <w:sz w:val="26"/>
-        </w:rPr>
-        <w:t>II. HƯỚNG DẪN 4 BƯỚC NỘP BÀI VIẾT MỚI CHI TIẾT</w:t>
-      </w:r>
-    </w:p>
-    <w:p>
-      <w:pPr>
-        <w:spacing w:before="120" w:after="40"/>
-      </w:pPr>
-      <w:r>
-        <w:rPr>
-          <w:b/>
-          <w:color w:val="C0392B"/>
-          <w:sz w:val="24"/>
-        </w:rPr>
-        <w:t>🔹 BƯỚC 1: XÁC ĐỊNH ĐỐI TƯỢNG NỘP BÀI</w:t>
-      </w:r>
-    </w:p>
-    <w:p>
-      <w:pPr>
-        <w:spacing w:after="80"/>
-      </w:pPr>
-      <w:r>
-        <w:rPr>
-          <w:b/>
-        </w:rPr>
-        <w:t xml:space="preserve">• Truy cập trang web: </w:t>
-      </w:r>
-      <w:r>
-        <w:t>https://bantruyenthong.pages.dev/</w:t>
-        <w:br/>
-      </w:r>
-      <w:r>
-        <w:rPr>
-          <w:color w:val="1E293B"/>
-        </w:rPr>
-        <w:t xml:space="preserve">• Ở thanh tác vụ đầu trang, giữ nguyên lựa chọn mặc định: </w:t>
+        <w:t xml:space="preserve">Thầy/Cô mở trình duyệt trên điện thoại hoặc máy tính và vào link: </w:t>
       </w:r>
       <w:r>
         <w:rPr>
           <w:b/>
         </w:rPr>
-        <w:t>“1. Nộp Bài Viết Mới”</w:t>
+        <w:t>https://bantruyenthong.pages.dev/</w:t>
+        <w:br/>
       </w:r>
       <w:r>
-        <w:rPr>
-          <w:color w:val="1E293B"/>
-        </w:rPr>
-        <w:t xml:space="preserve"> và đối tượng </w:t>
+        <w:t>Ngay phía trên, hệ thống đã chọn sẵn mặc định cho Thầy/Cô:</w:t>
+        <w:br/>
       </w:r>
       <w:r>
         <w:rPr>
           <w:b/>
         </w:rPr>
-        <w:t>“Giáo Viên / Tổ Chuyên Môn &amp; CLB”</w:t>
+        <w:t xml:space="preserve">• Tác vụ: </w:t>
       </w:r>
       <w:r>
-        <w:t>.</w:t>
+        <w:t>1. Nộp Bài Viết Mới</w:t>
+        <w:br/>
+      </w:r>
+      <w:r>
+        <w:rPr>
+          <w:b/>
+        </w:rPr>
+        <w:t xml:space="preserve">• Đối tượng: </w:t>
+      </w:r>
+      <w:r>
+        <w:t>Giáo Viên / Tổ Chuyên Môn &amp; CLB</w:t>
+        <w:br/>
+      </w:r>
+      <w:r>
+        <w:t>👉 Thầy/Cô chỉ cần giữ nguyên các lựa chọn này để tiếp tục.</w:t>
       </w:r>
     </w:p>
     <w:p>
       <w:pPr>
-        <w:spacing w:before="120" w:after="40"/>
+        <w:spacing w:before="120" w:after="60"/>
+        <w:jc w:val="center"/>
+      </w:pPr>
+    </w:p>
+    <w:p>
+      <w:r>
+        <w:drawing>
+          <wp:inline xmlns:a="http://schemas.openxmlformats.org/drawingml/2006/main" xmlns:pic="http://schemas.openxmlformats.org/drawingml/2006/picture">
+            <wp:extent cx="5669280" cy="2381098"/>
+            <wp:docPr id="1" name="Picture 1"/>
+            <wp:cNvGraphicFramePr>
+              <a:graphicFrameLocks noChangeAspect="1"/>
+            </wp:cNvGraphicFramePr>
+            <a:graphic>
+              <a:graphicData uri="http://schemas.openxmlformats.org/drawingml/2006/picture">
+                <pic:pic>
+                  <pic:nvPicPr>
+                    <pic:cNvPr id="0" name="hinh_1_trang_chu_chon_gv.png"/>
+                    <pic:cNvPicPr/>
+                  </pic:nvPicPr>
+                  <pic:blipFill>
+                    <a:blip r:embed="rId9"/>
+                    <a:stretch>
+                      <a:fillRect/>
+                    </a:stretch>
+                  </pic:blipFill>
+                  <pic:spPr>
+                    <a:xfrm>
+                      <a:off x="0" y="0"/>
+                      <a:ext cx="5669280" cy="2381098"/>
+                    </a:xfrm>
+                    <a:prstGeom prst="rect"/>
+                  </pic:spPr>
+                </pic:pic>
+              </a:graphicData>
+            </a:graphic>
+          </wp:inline>
+        </w:drawing>
+      </w:r>
+    </w:p>
+    <w:p>
+      <w:pPr>
+        <w:spacing w:before="40" w:after="200"/>
+        <w:jc w:val="center"/>
       </w:pPr>
       <w:r>
         <w:rPr>
+          <w:rFonts w:ascii="Arial" w:hAnsi="Arial"/>
+          <w:i/>
+          <w:color w:val="64748B"/>
+          <w:sz w:val="19"/>
+        </w:rPr>
+        <w:t>Hình 1: Giao diện trang chủ - Thầy/Cô giữ nguyên lựa chọn Giáo viên</w:t>
+      </w:r>
+    </w:p>
+    <w:p>
+      <w:pPr>
+        <w:spacing w:before="240" w:after="80"/>
+      </w:pPr>
+      <w:r>
+        <w:rPr>
+          <w:rFonts w:ascii="Arial" w:hAnsi="Arial"/>
           <w:b/>
           <w:color w:val="C0392B"/>
-          <w:sz w:val="24"/>
+          <w:sz w:val="25"/>
         </w:rPr>
-        <w:t>🔹 BƯỚC 2: KHAI BÁO THÔNG TIN ĐẠI DIỆN NỘP BÀI</w:t>
+        <w:t>BƯỚC 2: ĐIỀN THÔNG TIN THẦY/CÔ ĐẠI DIỆN</w:t>
       </w:r>
     </w:p>
     <w:p>
       <w:r>
-        <w:t>Tại khung số 1, Thầy/Cô điền 4 mục cơ bản:</w:t>
+        <w:t xml:space="preserve">Tại khung số </w:t>
+      </w:r>
+      <w:r>
+        <w:rPr>
+          <w:b/>
+        </w:rPr>
+        <w:t>1️⃣ Thông Tin Đại Diện Nộp Bài</w:t>
+      </w:r>
+      <w:r>
+        <w:t>, Thầy/Cô điền 4 mục ngắn gọn:</w:t>
+        <w:br/>
+      </w:r>
+      <w:r>
+        <w:rPr>
+          <w:b/>
+        </w:rPr>
+        <w:t xml:space="preserve">1. Tổ Chuyên Môn / Đơn Vị / CLB: </w:t>
+      </w:r>
+      <w:r>
+        <w:t>Bấm chọn đúng tên Tổ của mình (Toán, Vật lí, Hóa học, Ngữ văn, CLB...).</w:t>
+        <w:br/>
+      </w:r>
+      <w:r>
+        <w:rPr>
+          <w:b/>
+        </w:rPr>
+        <w:t xml:space="preserve">2. Họ và Tên Thầy/Cô Đại Diện: </w:t>
+      </w:r>
+      <w:r>
+        <w:t>Điền họ tên Thầy/Cô phụ trách bài viết.</w:t>
+        <w:br/>
+      </w:r>
+      <w:r>
+        <w:rPr>
+          <w:b/>
+        </w:rPr>
+        <w:t xml:space="preserve">3. Số Điện Thoại / Zalo: </w:t>
+      </w:r>
+      <w:r>
+        <w:t>Điền số điện thoại để BTT tiện liên lạc nhanh khi cần duyệt gấp.</w:t>
+        <w:br/>
+      </w:r>
+      <w:r>
+        <w:rPr>
+          <w:b/>
+        </w:rPr>
+        <w:t xml:space="preserve">4. Email Nhận Kết Quả Duyệt Bài: </w:t>
+      </w:r>
+      <w:r>
+        <w:t>Điền email chính xác để nhận thư biên nhận tự động kèm mã Ticket.</w:t>
       </w:r>
     </w:p>
     <w:p>
       <w:pPr>
-        <w:pStyle w:val="ListBullet"/>
-        <w:spacing w:before="20" w:after="40"/>
+        <w:spacing w:before="120" w:after="60"/>
+        <w:jc w:val="center"/>
       </w:pPr>
+    </w:p>
+    <w:p>
+      <w:r>
+        <w:drawing>
+          <wp:inline xmlns:a="http://schemas.openxmlformats.org/drawingml/2006/main" xmlns:pic="http://schemas.openxmlformats.org/drawingml/2006/picture">
+            <wp:extent cx="5669280" cy="2350506"/>
+            <wp:docPr id="2" name="Picture 2"/>
+            <wp:cNvGraphicFramePr>
+              <a:graphicFrameLocks noChangeAspect="1"/>
+            </wp:cNvGraphicFramePr>
+            <a:graphic>
+              <a:graphicData uri="http://schemas.openxmlformats.org/drawingml/2006/picture">
+                <pic:pic>
+                  <pic:nvPicPr>
+                    <pic:cNvPr id="0" name="hinh_2_thong_tin_nguoi_nop.png"/>
+                    <pic:cNvPicPr/>
+                  </pic:nvPicPr>
+                  <pic:blipFill>
+                    <a:blip r:embed="rId10"/>
+                    <a:stretch>
+                      <a:fillRect/>
+                    </a:stretch>
+                  </pic:blipFill>
+                  <pic:spPr>
+                    <a:xfrm>
+                      <a:off x="0" y="0"/>
+                      <a:ext cx="5669280" cy="2350506"/>
+                    </a:xfrm>
+                    <a:prstGeom prst="rect"/>
+                  </pic:spPr>
+                </pic:pic>
+              </a:graphicData>
+            </a:graphic>
+          </wp:inline>
+        </w:drawing>
+      </w:r>
+    </w:p>
+    <w:p>
+      <w:pPr>
+        <w:spacing w:before="40" w:after="200"/>
+        <w:jc w:val="center"/>
+      </w:pPr>
+      <w:r>
+        <w:rPr>
+          <w:rFonts w:ascii="Arial" w:hAnsi="Arial"/>
+          <w:i/>
+          <w:color w:val="64748B"/>
+          <w:sz w:val="19"/>
+        </w:rPr>
+        <w:t>Hình 2: Khung điền thông tin Thầy/Cô đại diện nộp bài</w:t>
+      </w:r>
+    </w:p>
+    <w:p>
+      <w:pPr>
+        <w:spacing w:before="240" w:after="80"/>
+      </w:pPr>
+      <w:r>
+        <w:rPr>
+          <w:rFonts w:ascii="Arial" w:hAnsi="Arial"/>
+          <w:b/>
+          <w:color w:val="C0392B"/>
+          <w:sz w:val="25"/>
+        </w:rPr>
+        <w:t>BƯỚC 3: NHẬP NỘI DUNG SỰ KIỆN &amp; VIẾT CAPTION</w:t>
+      </w:r>
+    </w:p>
+    <w:p>
+      <w:r>
+        <w:t xml:space="preserve">Tại khung số </w:t>
+      </w:r>
       <w:r>
         <w:rPr>
           <w:b/>
         </w:rPr>
-        <w:t xml:space="preserve">Tổ Chuyên Môn / Đơn Vị / CLB: </w:t>
+        <w:t>2️⃣ Nội Dung Sự Kiện &amp; Bài Viết</w:t>
       </w:r>
       <w:r>
-        <w:t>Bấm chọn đúng tổ chuyên môn của mình trong danh sách thả xuống (Toán, Ngữ văn, Tiếng Anh, Vật lí, Hóa học, Sinh học, Lịch sử, Địa lí, CLB...).</w:t>
+        <w:t>, Thầy/Cô hoàn thiện nội dung:</w:t>
+        <w:br/>
+      </w:r>
+      <w:r>
+        <w:rPr>
+          <w:b/>
+        </w:rPr>
+        <w:t xml:space="preserve">• Phân loại hoạt động: </w:t>
+      </w:r>
+      <w:r>
+        <w:t>Chọn Chuyên môn, Hoạt động học sinh, Phong trào Đoàn, Hội thi, Khen thưởng...</w:t>
+        <w:br/>
+      </w:r>
+      <w:r>
+        <w:rPr>
+          <w:b/>
+        </w:rPr>
+        <w:t xml:space="preserve">• Tên Sự Kiện / Tiêu Đề Bài Viết: </w:t>
+      </w:r>
+      <w:r>
+        <w:t>Viết ngắn gọn (Ví dụ: Chuyên đề STEM môn Vật lí...).</w:t>
+        <w:br/>
+      </w:r>
+      <w:r>
+        <w:rPr>
+          <w:b/>
+        </w:rPr>
+        <w:t xml:space="preserve">• Thời Gian &amp; Địa Điểm: </w:t>
+      </w:r>
+      <w:r>
+        <w:t>Ghi rõ thời gian, phòng học hoặc hội trường diễn ra.</w:t>
+        <w:br/>
+      </w:r>
+      <w:r>
+        <w:rPr>
+          <w:b/>
+        </w:rPr>
+        <w:t xml:space="preserve">• Caption Đề Xuất Đăng Fanpage / Web: </w:t>
+      </w:r>
+      <w:r>
+        <w:t>Thầy/Cô gõ nội dung hoặc dán từ Word sang.</w:t>
       </w:r>
     </w:p>
     <w:p>
       <w:pPr>
-        <w:pStyle w:val="ListBullet"/>
-        <w:spacing w:before="20" w:after="40"/>
+        <w:spacing w:before="120" w:after="60"/>
+        <w:jc w:val="center"/>
       </w:pPr>
+    </w:p>
+    <w:p>
       <w:r>
-        <w:rPr>
-          <w:b/>
-        </w:rPr>
-        <w:t xml:space="preserve">Họ và Tên Thầy/Cô Đại Diện: </w:t>
-      </w:r>
-      <w:r>
-        <w:t>Ghi đầy đủ họ và tên Thầy/Cô phụ trách hoặc cố vấn CLB.</w:t>
+        <w:drawing>
+          <wp:inline xmlns:a="http://schemas.openxmlformats.org/drawingml/2006/main" xmlns:pic="http://schemas.openxmlformats.org/drawingml/2006/picture">
+            <wp:extent cx="5669280" cy="5697346"/>
+            <wp:docPr id="3" name="Picture 3"/>
+            <wp:cNvGraphicFramePr>
+              <a:graphicFrameLocks noChangeAspect="1"/>
+            </wp:cNvGraphicFramePr>
+            <a:graphic>
+              <a:graphicData uri="http://schemas.openxmlformats.org/drawingml/2006/picture">
+                <pic:pic>
+                  <pic:nvPicPr>
+                    <pic:cNvPr id="0" name="hinh_3_noi_dung_caption.png"/>
+                    <pic:cNvPicPr/>
+                  </pic:nvPicPr>
+                  <pic:blipFill>
+                    <a:blip r:embed="rId11"/>
+                    <a:stretch>
+                      <a:fillRect/>
+                    </a:stretch>
+                  </pic:blipFill>
+                  <pic:spPr>
+                    <a:xfrm>
+                      <a:off x="0" y="0"/>
+                      <a:ext cx="5669280" cy="5697346"/>
+                    </a:xfrm>
+                    <a:prstGeom prst="rect"/>
+                  </pic:spPr>
+                </pic:pic>
+              </a:graphicData>
+            </a:graphic>
+          </wp:inline>
+        </w:drawing>
       </w:r>
     </w:p>
     <w:p>
       <w:pPr>
-        <w:pStyle w:val="ListBullet"/>
-        <w:spacing w:before="20" w:after="40"/>
+        <w:spacing w:before="40" w:after="200"/>
+        <w:jc w:val="center"/>
       </w:pPr>
       <w:r>
         <w:rPr>
-          <w:b/>
+          <w:rFonts w:ascii="Arial" w:hAnsi="Arial"/>
+          <w:i/>
+          <w:color w:val="64748B"/>
+          <w:sz w:val="19"/>
         </w:rPr>
-        <w:t xml:space="preserve">Số Điện Thoại / Zalo Liên Hệ: </w:t>
-      </w:r>
-      <w:r>
-        <w:t>Điền số điện thoại để Ban Biên Tập trao đổi nhanh khi cần duyệt gấp.</w:t>
-      </w:r>
-    </w:p>
-    <w:p>
-      <w:pPr>
-        <w:pStyle w:val="ListBullet"/>
-        <w:spacing w:before="20" w:after="40"/>
-      </w:pPr>
-      <w:r>
-        <w:rPr>
-          <w:b/>
-        </w:rPr>
-        <w:t xml:space="preserve">Email Nhận Kết Quả Duyệt Bài: </w:t>
-      </w:r>
-      <w:r>
-        <w:t>Điền email chính xác để nhận thư xác nhận kèm Mã Ticket và link kiểm tra bài.</w:t>
-      </w:r>
-    </w:p>
-    <w:p>
-      <w:pPr>
-        <w:spacing w:before="120" w:after="40"/>
-      </w:pPr>
-      <w:r>
-        <w:rPr>
-          <w:b/>
-          <w:color w:val="C0392B"/>
-          <w:sz w:val="24"/>
-        </w:rPr>
-        <w:t>🔹 BƯỚC 3: NHẬP NỘI DUNG SỰ KIỆN &amp; BÀI VIẾT (CAPTION)</w:t>
-      </w:r>
-    </w:p>
-    <w:p>
-      <w:r>
-        <w:t>Tại khung số 2, Thầy/Cô hoàn thiện thông tin nội dung:</w:t>
-      </w:r>
-    </w:p>
-    <w:p>
-      <w:pPr>
-        <w:pStyle w:val="ListBullet"/>
-        <w:spacing w:before="20" w:after="40"/>
-      </w:pPr>
-      <w:r>
-        <w:rPr>
-          <w:b/>
-        </w:rPr>
-        <w:t xml:space="preserve">Phân Loại Hoạt Động: </w:t>
-      </w:r>
-      <w:r>
-        <w:t>Chọn đúng tính chất sự kiện (Hoạt động chuyên môn, Hoạt động học sinh, Đoàn - Phong trào, Hội thi các cấp, Thành tích/Khen thưởng...).</w:t>
-      </w:r>
-    </w:p>
-    <w:p>
-      <w:pPr>
-        <w:pStyle w:val="ListBullet"/>
-        <w:spacing w:before="20" w:after="40"/>
-      </w:pPr>
-      <w:r>
-        <w:rPr>
-          <w:b/>
-        </w:rPr>
-        <w:t xml:space="preserve">Tên Sự Kiện / Tiêu Đề Bài Viết: </w:t>
-      </w:r>
-      <w:r>
-        <w:t>Viết ngắn gọn, súc tích (Ví dụ: Chuyên đề STEM môn Vật lí: Ứng dụng năng lượng tái tạo).</w:t>
-      </w:r>
-    </w:p>
-    <w:p>
-      <w:pPr>
-        <w:pStyle w:val="ListBullet"/>
-        <w:spacing w:before="20" w:after="40"/>
-      </w:pPr>
-      <w:r>
-        <w:rPr>
-          <w:b/>
-        </w:rPr>
-        <w:t xml:space="preserve">Thời Gian &amp; Địa Điểm Diễn Ra: </w:t>
-      </w:r>
-      <w:r>
-        <w:t>Ghi rõ thời gian, phòng học hoặc địa điểm tổ chức (Ví dụ: Sáng thứ Hai 12/10/2026 tại Hội trường A).</w:t>
-      </w:r>
-    </w:p>
-    <w:p>
-      <w:pPr>
-        <w:pStyle w:val="ListBullet"/>
-        <w:spacing w:before="20" w:after="40"/>
-      </w:pPr>
-      <w:r>
-        <w:rPr>
-          <w:b/>
-        </w:rPr>
-        <w:t xml:space="preserve">Caption Đề Xuất Đăng Fanpage / Web: </w:t>
-      </w:r>
-      <w:r>
-        <w:t>Soạn thảo bài viết vào khung này. Thầy/Cô có thể gõ trực tiếp hoặc dán từ Word sang.</w:t>
+        <w:t>Hình 3: Khung nội dung bài viết và nút chèn Footer mẫu chuẩn</w:t>
       </w:r>
     </w:p>
     <w:tbl>
@@ -550,12 +562,12 @@
             <w:tcMar>
               <w:top w:w="140" w:type="dxa"/>
               <w:bottom w:w="140" w:type="dxa"/>
-              <w:left w:w="200" w:type="dxa"/>
-              <w:right w:w="200" w:type="dxa"/>
+              <w:left w:w="180" w:type="dxa"/>
+              <w:right w:w="180" w:type="dxa"/>
             </w:tcMar>
             <w:tcBorders>
               <w:top w:val="none"/>
-              <w:left w:val="single" w:sz="36" w:space="0" w:color="D97706"/>
+              <w:left w:val="single" w:sz="30" w:space="0" w:color="D97706"/>
               <w:bottom w:val="none"/>
               <w:right w:val="none"/>
             </w:tcBorders>
@@ -566,12 +578,12 @@
             </w:pPr>
             <w:r>
               <w:rPr>
-                <w:rFonts w:ascii="Times New Roman" w:hAnsi="Times New Roman"/>
+                <w:rFonts w:ascii="Arial" w:hAnsi="Arial"/>
                 <w:b/>
                 <w:color w:val="0F3E6D"/>
-                <w:sz w:val="23"/>
+                <w:sz w:val="22"/>
               </w:rPr>
-              <w:t>💡 MẸO TIỆN ÍCH: CHÈN NHANH CHÂN TRANG (FOOTER) CHUẨN MĐC</w:t>
+              <w:t>⭐ MẸO CỰC TIỆN: BẤM NÚT CHÈN FOOTER CHUẨN MĐC</w:t>
               <w:br/>
             </w:r>
           </w:p>
@@ -581,11 +593,11 @@
             </w:pPr>
             <w:r>
               <w:rPr>
-                <w:rFonts w:ascii="Times New Roman" w:hAnsi="Times New Roman"/>
-                <w:color w:val="1E293B"/>
-                <w:sz w:val="22"/>
+                <w:rFonts w:ascii="Arial" w:hAnsi="Arial"/>
+                <w:color w:val="334155"/>
+                <w:sz w:val="21"/>
               </w:rPr>
-              <w:t>Ngay phía trên ô nhập Caption có nút: [Chèn mẫu Footer chuẩn vào Caption].</w:t>
+              <w:t>Ngay phía trên ô nhập Caption có nút màu xanh: [Chèn mẫu Footer chuẩn vào Caption].</w:t>
             </w:r>
           </w:p>
           <w:p>
@@ -594,11 +606,11 @@
             </w:pPr>
             <w:r>
               <w:rPr>
-                <w:rFonts w:ascii="Times New Roman" w:hAnsi="Times New Roman"/>
-                <w:color w:val="1E293B"/>
-                <w:sz w:val="22"/>
+                <w:rFonts w:ascii="Arial" w:hAnsi="Arial"/>
+                <w:color w:val="334155"/>
+                <w:sz w:val="21"/>
               </w:rPr>
-              <w:t>Thầy/Cô chỉ cần bấm 1 lần vào nút này, hệ thống sẽ tự động chèn sẵn khối thông tin chuẩn của trường bao gồm: Chịu trách nhiệm nội dung, Chịu trách nhiệm hình ảnh, Địa chỉ trường (Số 4 Tân Hòa Đông), Link Website, Fanpage chính thức và Hashtag #THPTMacDinhChi.</w:t>
+              <w:t>Thầy/Cô chỉ cần bấm 1 cái vào nút này, hệ thống sẽ tự động chèn sẵn toàn bộ chân trang gồm: Chịu trách nhiệm nội dung, Chịu trách nhiệm hình ảnh, Địa chỉ trường (Số 4 Tân Hòa Đông), Link Website, Fanpage chính thức và Hashtag #THPTMacDinhChi.</w:t>
             </w:r>
           </w:p>
           <w:p>
@@ -607,11 +619,11 @@
             </w:pPr>
             <w:r>
               <w:rPr>
-                <w:rFonts w:ascii="Times New Roman" w:hAnsi="Times New Roman"/>
-                <w:color w:val="1E293B"/>
-                <w:sz w:val="22"/>
+                <w:rFonts w:ascii="Arial" w:hAnsi="Arial"/>
+                <w:color w:val="334155"/>
+                <w:sz w:val="21"/>
               </w:rPr>
-              <w:t>Thầy/Cô chỉ cần viết phần diễn biến sự kiện ở phía trên và ghi tên mình vào mục Chịu trách nhiệm nội dung/hình ảnh.</w:t>
+              <w:t>👉 Thầy/Cô chỉ việc viết phần diễn biến sự kiện ở phía trên và điền tên mình vào là xong!</w:t>
             </w:r>
           </w:p>
         </w:tc>
@@ -619,70 +631,270 @@
     </w:tbl>
     <w:p>
       <w:pPr>
-        <w:spacing w:after="80"/>
+        <w:spacing w:before="0" w:after="80"/>
       </w:pPr>
     </w:p>
     <w:p>
       <w:pPr>
-        <w:spacing w:before="120" w:after="40"/>
+        <w:spacing w:before="240" w:after="80"/>
       </w:pPr>
       <w:r>
         <w:rPr>
+          <w:rFonts w:ascii="Arial" w:hAnsi="Arial"/>
           <w:b/>
           <w:color w:val="C0392B"/>
-          <w:sz w:val="24"/>
+          <w:sz w:val="25"/>
         </w:rPr>
-        <w:t>🔹 BƯỚC 4: TẢI HÌNH ẢNH / VIDEO GỐC &amp; BẤM GỬI BÀI DUYỆT</w:t>
+        <w:t>BƯỚC 4: TẢI ẢNH/VIDEO GỐC VÀ BẤM GỬI BÀI DUYỆT</w:t>
       </w:r>
     </w:p>
     <w:p>
       <w:r>
-        <w:t>Tại khung số 3, Thầy/Cô tiến hành đính kèm tư liệu:</w:t>
+        <w:t xml:space="preserve">Tại khung số </w:t>
+      </w:r>
+      <w:r>
+        <w:rPr>
+          <w:b/>
+        </w:rPr>
+        <w:t>3️⃣ Tải Lên Hình Ảnh &amp; Video Gốc</w:t>
+      </w:r>
+      <w:r>
+        <w:t>:</w:t>
+        <w:br/>
+      </w:r>
+      <w:r>
+        <w:rPr>
+          <w:b/>
+        </w:rPr>
+        <w:t xml:space="preserve">1. Chọn ảnh/video từ máy: </w:t>
+      </w:r>
+      <w:r>
+        <w:t>Bấm vào vùng ô nét đứt có biểu tượng đám mây để chọn ảnh từ máy tính hoặc album điện thoại (hỗ trợ JPG, PNG, MP4, MOV, PDF, Word; tối đa 20 file).</w:t>
+        <w:br/>
+      </w:r>
+      <w:r>
+        <w:rPr>
+          <w:b/>
+        </w:rPr>
+        <w:t xml:space="preserve">2. Nếu có Video dung lượng lớn (nhiều trăm MB đến vài GB): </w:t>
+      </w:r>
+      <w:r>
+        <w:t>Thầy/Cô không cần tải trực tiếp, chỉ cần tải video lên Google Drive cá nhân, mở quyền chia sẻ và dán link vào ô “Link Google Drive / Cloud chứa Video dung lượng lớn”.</w:t>
+        <w:br/>
+      </w:r>
+      <w:r>
+        <w:rPr>
+          <w:b/>
+        </w:rPr>
+        <w:t xml:space="preserve">3. Bấm nút: </w:t>
+      </w:r>
+      <w:r>
+        <w:rPr>
+          <w:b/>
+        </w:rPr>
+        <w:t>GỬI BÀI DUYỆT TRUYỀN THÔNG</w:t>
+        <w:br/>
+      </w:r>
+      <w:r>
+        <w:t xml:space="preserve">👉 Đợi 5 – 15 giây, màn hình sẽ hiện hộp thông báo chúc mừng: </w:t>
+      </w:r>
+      <w:r>
+        <w:rPr>
+          <w:b/>
+        </w:rPr>
+        <w:t>NỘP BÀI THÀNH CÔNG!</w:t>
+      </w:r>
+      <w:r>
+        <w:t xml:space="preserve"> kèm mã bài viết </w:t>
+      </w:r>
+      <w:r>
+        <w:rPr>
+          <w:b/>
+        </w:rPr>
+        <w:t>TT-2026-XXXX</w:t>
+      </w:r>
+      <w:r>
+        <w:t xml:space="preserve"> và email xác nhận được gửi ngay về hòm thư của Thầy/Cô.</w:t>
       </w:r>
     </w:p>
     <w:p>
       <w:pPr>
-        <w:pStyle w:val="ListBullet"/>
-        <w:spacing w:before="20" w:after="40"/>
+        <w:spacing w:before="120" w:after="60"/>
+        <w:jc w:val="center"/>
       </w:pPr>
+    </w:p>
+    <w:p>
+      <w:r>
+        <w:drawing>
+          <wp:inline xmlns:a="http://schemas.openxmlformats.org/drawingml/2006/main" xmlns:pic="http://schemas.openxmlformats.org/drawingml/2006/picture">
+            <wp:extent cx="5669280" cy="4436828"/>
+            <wp:docPr id="4" name="Picture 4"/>
+            <wp:cNvGraphicFramePr>
+              <a:graphicFrameLocks noChangeAspect="1"/>
+            </wp:cNvGraphicFramePr>
+            <a:graphic>
+              <a:graphicData uri="http://schemas.openxmlformats.org/drawingml/2006/picture">
+                <pic:pic>
+                  <pic:nvPicPr>
+                    <pic:cNvPr id="0" name="hinh_4_tai_anh_video_gui_bai.png"/>
+                    <pic:cNvPicPr/>
+                  </pic:nvPicPr>
+                  <pic:blipFill>
+                    <a:blip r:embed="rId12"/>
+                    <a:stretch>
+                      <a:fillRect/>
+                    </a:stretch>
+                  </pic:blipFill>
+                  <pic:spPr>
+                    <a:xfrm>
+                      <a:off x="0" y="0"/>
+                      <a:ext cx="5669280" cy="4436828"/>
+                    </a:xfrm>
+                    <a:prstGeom prst="rect"/>
+                  </pic:spPr>
+                </pic:pic>
+              </a:graphicData>
+            </a:graphic>
+          </wp:inline>
+        </w:drawing>
+      </w:r>
+    </w:p>
+    <w:p>
+      <w:pPr>
+        <w:spacing w:before="40" w:after="200"/>
+        <w:jc w:val="center"/>
+      </w:pPr>
+      <w:r>
+        <w:rPr>
+          <w:rFonts w:ascii="Arial" w:hAnsi="Arial"/>
+          <w:i/>
+          <w:color w:val="64748B"/>
+          <w:sz w:val="19"/>
+        </w:rPr>
+        <w:t>Hình 4: Vùng kéo thả ảnh/video và ô dán link Google Drive video lớn</w:t>
+      </w:r>
+    </w:p>
+    <w:p>
+      <w:pPr>
+        <w:spacing w:before="240" w:after="80"/>
+      </w:pPr>
+      <w:r>
+        <w:rPr>
+          <w:rFonts w:ascii="Arial" w:hAnsi="Arial"/>
+          <w:b/>
+          <w:color w:val="C0392B"/>
+          <w:sz w:val="25"/>
+        </w:rPr>
+        <w:t>KHI CẦN: CÁCH TRA CỨU &amp; BỔ SUNG / SỬA BÀI THEO PHẢN HỒI</w:t>
+      </w:r>
+    </w:p>
+    <w:p>
+      <w:r>
+        <w:t xml:space="preserve">Nếu Ban Biên Tập duyệt bài và nhận thấy cần bổ sung ảnh nét hơn hoặc làm rõ thông tin học sinh đạt giải, Thầy/Cô </w:t>
+      </w:r>
       <w:r>
         <w:rPr>
           <w:b/>
         </w:rPr>
-        <w:t xml:space="preserve">Tải tệp ảnh/video trực tiếp: </w:t>
+        <w:t>KHÔNG CẦN nộp lại bài mới</w:t>
       </w:r>
       <w:r>
-        <w:t>Bấm vào khung nét đứt có biểu tượng tải lên để chọn ảnh/video từ máy tính hoặc album điện thoại (hỗ trợ JPG, PNG, MP4, MOV, PDF, Word - tối đa 20 file, 50MB/file). Thầy/Cô có thể bấm dấu [✕] để xóa bớt ảnh nếu chọn nhầm.</w:t>
+        <w:t>, mà chỉ cần làm như sau:</w:t>
+        <w:br/>
+      </w:r>
+      <w:r>
+        <w:rPr>
+          <w:b/>
+        </w:rPr>
+        <w:t xml:space="preserve">1. Bấm vào tab: </w:t>
+      </w:r>
+      <w:r>
+        <w:t>“2. Bổ Sung / Sửa Bài Viết” ở đầu trang web.</w:t>
+        <w:br/>
+      </w:r>
+      <w:r>
+        <w:rPr>
+          <w:b/>
+        </w:rPr>
+        <w:t xml:space="preserve">2. Nhập: </w:t>
+      </w:r>
+      <w:r>
+        <w:t>Mã Ticket ID (Ví dụ: TT-2026-0012) hoặc Họ tên / SĐT của Thầy/Cô ➔ Bấm “Tìm bài viết”.</w:t>
+        <w:br/>
+      </w:r>
+      <w:r>
+        <w:rPr>
+          <w:b/>
+        </w:rPr>
+        <w:t xml:space="preserve">3. Xem hộp thông báo màu vàng: </w:t>
+      </w:r>
+      <w:r>
+        <w:t>Đọc kỹ lời dặn của BTT xem cần bổ sung chi tiết gì.</w:t>
+        <w:br/>
+      </w:r>
+      <w:r>
+        <w:t>4. Sửa Caption hoặc bấm chọn thêm ảnh mới ➔ Bấm “GỬI BẢN CẬP NHẬT CHỈNH SỬA”.</w:t>
+        <w:br/>
+      </w:r>
+      <w:r>
+        <w:t>👉 Bài viết sẽ tự động chuyển sang trạng thái ĐÃ SỬA – CHỜ DUYỆT để BTT ưu tiên duyệt đăng ngay cho Tổ.</w:t>
       </w:r>
     </w:p>
     <w:p>
       <w:pPr>
-        <w:pStyle w:val="ListBullet"/>
-        <w:spacing w:before="20" w:after="40"/>
+        <w:spacing w:before="120" w:after="60"/>
+        <w:jc w:val="center"/>
       </w:pPr>
+    </w:p>
+    <w:p>
       <w:r>
-        <w:rPr>
-          <w:b/>
-        </w:rPr>
-        <w:t xml:space="preserve">Dán link đối với Video dung lượng lớn: </w:t>
-      </w:r>
-      <w:r>
-        <w:t>Nếu có video nặng hàng trăm MB đến nhiều GB, Thầy/Cô chỉ cần dán link Google Drive hoặc OneDrive chia sẻ vào ô “Link Google Drive / Cloud chứa Video dung lượng lớn”.</w:t>
+        <w:drawing>
+          <wp:inline xmlns:a="http://schemas.openxmlformats.org/drawingml/2006/main" xmlns:pic="http://schemas.openxmlformats.org/drawingml/2006/picture">
+            <wp:extent cx="5669280" cy="2834640"/>
+            <wp:docPr id="5" name="Picture 5"/>
+            <wp:cNvGraphicFramePr>
+              <a:graphicFrameLocks noChangeAspect="1"/>
+            </wp:cNvGraphicFramePr>
+            <a:graphic>
+              <a:graphicData uri="http://schemas.openxmlformats.org/drawingml/2006/picture">
+                <pic:pic>
+                  <pic:nvPicPr>
+                    <pic:cNvPr id="0" name="hinh_5_tra_cuu_sua_bai.png"/>
+                    <pic:cNvPicPr/>
+                  </pic:nvPicPr>
+                  <pic:blipFill>
+                    <a:blip r:embed="rId13"/>
+                    <a:stretch>
+                      <a:fillRect/>
+                    </a:stretch>
+                  </pic:blipFill>
+                  <pic:spPr>
+                    <a:xfrm>
+                      <a:off x="0" y="0"/>
+                      <a:ext cx="5669280" cy="2834640"/>
+                    </a:xfrm>
+                    <a:prstGeom prst="rect"/>
+                  </pic:spPr>
+                </pic:pic>
+              </a:graphicData>
+            </a:graphic>
+          </wp:inline>
+        </w:drawing>
       </w:r>
     </w:p>
     <w:p>
       <w:pPr>
-        <w:pStyle w:val="ListBullet"/>
-        <w:spacing w:before="20" w:after="40"/>
+        <w:spacing w:before="40" w:after="200"/>
+        <w:jc w:val="center"/>
       </w:pPr>
       <w:r>
         <w:rPr>
-          <w:b/>
+          <w:rFonts w:ascii="Arial" w:hAnsi="Arial"/>
+          <w:i/>
+          <w:color w:val="64748B"/>
+          <w:sz w:val="19"/>
         </w:rPr>
-        <w:t xml:space="preserve">Bấm nút GỬI BÀI DUYỆT TRUYỀN THÔNG: </w:t>
-      </w:r>
-      <w:r>
-        <w:t>Bấm nút màu xanh đậm ở cuối trang và chờ từ 5 - 15 giây để hệ thống tải file lên Drive.</w:t>
+        <w:t>Hình 5: Tab tra cứu và chỉnh sửa bài viết theo phản hồi của BTT</w:t>
       </w:r>
     </w:p>
     <w:tbl>
@@ -698,16 +910,16 @@
         <w:tc>
           <w:tcPr>
             <w:tcW w:type="dxa" w:w="9605"/>
-            <w:shd w:fill="F0FDF4"/>
+            <w:shd w:fill="F8FAFC"/>
             <w:tcMar>
               <w:top w:w="140" w:type="dxa"/>
               <w:bottom w:w="140" w:type="dxa"/>
-              <w:left w:w="200" w:type="dxa"/>
-              <w:right w:w="200" w:type="dxa"/>
+              <w:left w:w="180" w:type="dxa"/>
+              <w:right w:w="180" w:type="dxa"/>
             </w:tcMar>
             <w:tcBorders>
               <w:top w:val="none"/>
-              <w:left w:val="single" w:sz="36" w:space="0" w:color="16A34A"/>
+              <w:left w:val="single" w:sz="30" w:space="0" w:color="64748B"/>
               <w:bottom w:val="none"/>
               <w:right w:val="none"/>
             </w:tcBorders>
@@ -718,12 +930,12 @@
             </w:pPr>
             <w:r>
               <w:rPr>
-                <w:rFonts w:ascii="Times New Roman" w:hAnsi="Times New Roman"/>
+                <w:rFonts w:ascii="Arial" w:hAnsi="Arial"/>
                 <w:b/>
                 <w:color w:val="0F3E6D"/>
-                <w:sz w:val="23"/>
+                <w:sz w:val="22"/>
               </w:rPr>
-              <w:t>💡 KẾT QUẢ SAU KHI NỘP BÀI THÀNH CÔNG</w:t>
+              <w:t>📌 VÀI LƯU Ý NHỎ GIÚP BÀI ĐĂNG HOÀN HẢO</w:t>
               <w:br/>
             </w:r>
           </w:p>
@@ -733,11 +945,11 @@
             </w:pPr>
             <w:r>
               <w:rPr>
-                <w:rFonts w:ascii="Times New Roman" w:hAnsi="Times New Roman"/>
-                <w:color w:val="1E293B"/>
-                <w:sz w:val="22"/>
+                <w:rFonts w:ascii="Arial" w:hAnsi="Arial"/>
+                <w:color w:val="334155"/>
+                <w:sz w:val="21"/>
               </w:rPr>
-              <w:t>Màn hình sẽ hiển thị hộp thoại màu xanh: 'NỘP BÀI THÀNH CÔNG!'.</w:t>
+              <w:t>📅 Thời điểm gửi bài lý tưởng: Trong vòng 24h - 48h sau sự kiện để bài đăng có tính thời sự cao nhất.</w:t>
             </w:r>
           </w:p>
           <w:p>
@@ -746,11 +958,11 @@
             </w:pPr>
             <w:r>
               <w:rPr>
-                <w:rFonts w:ascii="Times New Roman" w:hAnsi="Times New Roman"/>
-                <w:color w:val="1E293B"/>
-                <w:sz w:val="22"/>
+                <w:rFonts w:ascii="Arial" w:hAnsi="Arial"/>
+                <w:color w:val="334155"/>
+                <w:sz w:val="21"/>
               </w:rPr>
-              <w:t>Kèm theo Mã Ticket ID định danh duy nhất (ví dụ: TT-2026-0015).</w:t>
+              <w:t>📸 Chất lượng ảnh: Thầy/Cô nên chọn ảnh gốc rõ nét, tránh gửi qua Zalo/Facebook thông thường vì ảnh sẽ bị giảm chất lượng.</w:t>
             </w:r>
           </w:p>
           <w:p>
@@ -759,11 +971,11 @@
             </w:pPr>
             <w:r>
               <w:rPr>
-                <w:rFonts w:ascii="Times New Roman" w:hAnsi="Times New Roman"/>
-                <w:color w:val="1E293B"/>
-                <w:sz w:val="22"/>
+                <w:rFonts w:ascii="Arial" w:hAnsi="Arial"/>
+                <w:color w:val="334155"/>
+                <w:sz w:val="21"/>
               </w:rPr>
-              <w:t>Hệ thống đồng thời gửi 1 Email xác nhận về hòm thư của Thầy/Cô.</w:t>
+              <w:t>✍️ Rà soát họ tên: Kiểm tra chính xác họ tên Thầy/Cô và học sinh đạt giải để đăng tin tuyên dương chuẩn xác.</w:t>
             </w:r>
           </w:p>
           <w:p>
@@ -772,11 +984,11 @@
             </w:pPr>
             <w:r>
               <w:rPr>
-                <w:rFonts w:ascii="Times New Roman" w:hAnsi="Times New Roman"/>
-                <w:color w:val="1E293B"/>
-                <w:sz w:val="22"/>
+                <w:rFonts w:ascii="Arial" w:hAnsi="Arial"/>
+                <w:color w:val="334155"/>
+                <w:sz w:val="21"/>
               </w:rPr>
-              <w:t>Thầy/Cô lưu lại mã bài này hoặc giữ email để theo dõi tiến độ duyệt bài.</w:t>
+              <w:t>📞 Hỗ trợ kỹ thuật 24/7: Thầy Nguyễn Hồ Trọng Tín (Tổ Tin học) - Thầy/Cô có thể nhắn trực tiếp qua Zalo bất cứ lúc nào.</w:t>
             </w:r>
           </w:p>
         </w:tc>
@@ -784,429 +996,23 @@
     </w:tbl>
     <w:p>
       <w:pPr>
-        <w:spacing w:after="80"/>
+        <w:spacing w:before="0" w:after="80"/>
       </w:pPr>
     </w:p>
     <w:p>
       <w:pPr>
-        <w:spacing w:before="280" w:after="80"/>
+        <w:spacing w:before="160" w:after="80"/>
       </w:pPr>
       <w:r>
         <w:rPr>
+          <w:rFonts w:ascii="Arial" w:hAnsi="Arial"/>
           <w:b/>
+          <w:i/>
           <w:color w:val="0F3E6D"/>
-          <w:sz w:val="26"/>
         </w:rPr>
-        <w:t>III. HƯỚNG DẪN TRA CỨU &amp; CHỈNH SỬA / BỔ SUNG BÀI VIẾT (KHI CÓ YÊU CẦU)</w:t>
+        <w:t>Ban Truyền Thông trường THPT Mạc Đĩnh Chi trân trọng cảm ơn sự phối hợp và đồng hành của Quý Thầy/Cô! ❤️</w:t>
       </w:r>
     </w:p>
-    <w:p>
-      <w:r>
-        <w:t xml:space="preserve">Khi Ban Biên Tập kiểm duyệt và gửi yêu cầu điều chỉnh (qua Email hoặc Zalo) như: bổ sung ảnh rõ hơn, đính chính tên đại biểu/học sinh, Thầy/Cô </w:t>
-      </w:r>
-      <w:r>
-        <w:rPr>
-          <w:b/>
-        </w:rPr>
-        <w:t>KHÔNG CẦN nộp lại bài mới</w:t>
-      </w:r>
-      <w:r>
-        <w:t>, mà chỉ cần chỉnh sửa trực tiếp theo các bước sau:</w:t>
-      </w:r>
-    </w:p>
-    <w:p>
-      <w:pPr>
-        <w:pStyle w:val="ListBullet"/>
-        <w:spacing w:before="20" w:after="40"/>
-      </w:pPr>
-      <w:r>
-        <w:rPr>
-          <w:b/>
-        </w:rPr>
-        <w:t xml:space="preserve">Bước 1: </w:t>
-      </w:r>
-      <w:r>
-        <w:t>Trên đầu trang web, bấm vào tab “2. Bổ Sung / Sửa Bài Viết”.</w:t>
-      </w:r>
-    </w:p>
-    <w:p>
-      <w:pPr>
-        <w:pStyle w:val="ListBullet"/>
-        <w:spacing w:before="20" w:after="40"/>
-      </w:pPr>
-      <w:r>
-        <w:rPr>
-          <w:b/>
-        </w:rPr>
-        <w:t xml:space="preserve">Bước 2: </w:t>
-      </w:r>
-      <w:r>
-        <w:t>Nhập Mã Ticket ID (Ví dụ: TT-2026-0015) hoặc nhập Họ tên / Số điện thoại của Thầy/Cô vào ô tìm kiếm ➔ Bấm nút “Tìm bài viết”.</w:t>
-      </w:r>
-    </w:p>
-    <w:p>
-      <w:pPr>
-        <w:pStyle w:val="ListBullet"/>
-        <w:spacing w:before="20" w:after="40"/>
-      </w:pPr>
-      <w:r>
-        <w:rPr>
-          <w:b/>
-        </w:rPr>
-        <w:t xml:space="preserve">Bước 3: </w:t>
-      </w:r>
-      <w:r>
-        <w:t>Xem hộp phản hồi màu vàng “📢 NỘI DUNG CẦN ĐIỀU CHỈNH / BỔ SUNG TỪ BAN BIÊN TẬP” để biết chính xác Thầy/Cô cần bổ sung thông tin gì.</w:t>
-      </w:r>
-    </w:p>
-    <w:p>
-      <w:pPr>
-        <w:pStyle w:val="ListBullet"/>
-        <w:spacing w:before="20" w:after="40"/>
-      </w:pPr>
-      <w:r>
-        <w:rPr>
-          <w:b/>
-        </w:rPr>
-        <w:t xml:space="preserve">Bước 4: </w:t>
-      </w:r>
-      <w:r>
-        <w:t>Sửa lại Caption trực tiếp trong ô văn bản, hoặc bấm tải thêm ảnh/video rõ nét hơn.</w:t>
-      </w:r>
-    </w:p>
-    <w:p>
-      <w:pPr>
-        <w:pStyle w:val="ListBullet"/>
-        <w:spacing w:before="20" w:after="40"/>
-      </w:pPr>
-      <w:r>
-        <w:rPr>
-          <w:b/>
-        </w:rPr>
-        <w:t xml:space="preserve">Bước 5: </w:t>
-      </w:r>
-      <w:r>
-        <w:t>Bấm nút “GỬI BẢN CẬP NHẬT CHỈNH SỬA”. Trạng thái bài viết sẽ tự động chuyển thành 'ĐÃ SỬA – CHỜ DUYỆT' để BTT ưu tiên duyệt và xuất bản ngay.</w:t>
-      </w:r>
-    </w:p>
-    <w:p>
-      <w:pPr>
-        <w:spacing w:before="280" w:after="80"/>
-      </w:pPr>
-      <w:r>
-        <w:rPr>
-          <w:b/>
-          <w:color w:val="0F3E6D"/>
-          <w:sz w:val="26"/>
-        </w:rPr>
-        <w:t>IV. CÁC QUY ĐỊNH VÀ LƯU Ý QUAN TRỌNG VỀ TRUYỀN THÔNG</w:t>
-      </w:r>
-    </w:p>
-    <w:tbl>
-      <w:tblPr>
-        <w:tblW w:type="auto" w:w="0"/>
-        <w:jc w:val="center"/>
-        <w:tblLayout w:type="fixed"/>
-        <w:tblLook w:firstColumn="1" w:firstRow="1" w:lastColumn="0" w:lastRow="0" w:noHBand="0" w:noVBand="1" w:val="04A0"/>
-      </w:tblPr>
-      <w:tblGrid>
-        <w:gridCol w:w="4802"/>
-        <w:gridCol w:w="4802"/>
-      </w:tblGrid>
-      <w:tr>
-        <w:tc>
-          <w:tcPr>
-            <w:tcW w:type="dxa" w:w="3168"/>
-            <w:tcMar>
-              <w:top w:w="80" w:type="dxa"/>
-              <w:bottom w:w="80" w:type="dxa"/>
-              <w:left w:w="120" w:type="dxa"/>
-              <w:right w:w="120" w:type="dxa"/>
-            </w:tcMar>
-            <w:shd w:fill="1A56DB"/>
-          </w:tcPr>
-          <w:p>
-            <w:r>
-              <w:rPr>
-                <w:b/>
-                <w:color w:val="FFFFFF"/>
-              </w:rPr>
-              <w:t>Nội dung quy định</w:t>
-            </w:r>
-          </w:p>
-        </w:tc>
-        <w:tc>
-          <w:tcPr>
-            <w:tcW w:type="dxa" w:w="7200"/>
-            <w:tcMar>
-              <w:top w:w="80" w:type="dxa"/>
-              <w:bottom w:w="80" w:type="dxa"/>
-              <w:left w:w="120" w:type="dxa"/>
-              <w:right w:w="120" w:type="dxa"/>
-            </w:tcMar>
-            <w:shd w:fill="1A56DB"/>
-          </w:tcPr>
-          <w:p>
-            <w:r>
-              <w:rPr>
-                <w:b/>
-                <w:color w:val="FFFFFF"/>
-              </w:rPr>
-              <w:t>Yêu cầu chi tiết thực hiện</w:t>
-            </w:r>
-          </w:p>
-        </w:tc>
-      </w:tr>
-      <w:tr>
-        <w:tc>
-          <w:tcPr>
-            <w:tcW w:type="dxa" w:w="3168"/>
-            <w:tcMar>
-              <w:top w:w="80" w:type="dxa"/>
-              <w:bottom w:w="80" w:type="dxa"/>
-              <w:left w:w="120" w:type="dxa"/>
-              <w:right w:w="120" w:type="dxa"/>
-            </w:tcMar>
-            <w:shd w:fill="F8FAFC"/>
-          </w:tcPr>
-          <w:p>
-            <w:r>
-              <w:rPr>
-                <w:b/>
-              </w:rPr>
-              <w:t>1. Thời hạn nộp bài</w:t>
-            </w:r>
-          </w:p>
-        </w:tc>
-        <w:tc>
-          <w:tcPr>
-            <w:tcW w:type="dxa" w:w="7200"/>
-            <w:tcMar>
-              <w:top w:w="80" w:type="dxa"/>
-              <w:bottom w:w="80" w:type="dxa"/>
-              <w:left w:w="120" w:type="dxa"/>
-              <w:right w:w="120" w:type="dxa"/>
-            </w:tcMar>
-            <w:shd w:fill="F8FAFC"/>
-          </w:tcPr>
-          <w:p>
-            <w:r>
-              <w:t>Gửi tư liệu chậm nhất trong vòng 24h - 48h sau khi kết thúc sự kiện để đảm bảo tính thời sự và tương tác cao nhất trên Fanpage.</w:t>
-            </w:r>
-          </w:p>
-        </w:tc>
-      </w:tr>
-      <w:tr>
-        <w:tc>
-          <w:tcPr>
-            <w:tcW w:type="dxa" w:w="3168"/>
-            <w:tcMar>
-              <w:top w:w="80" w:type="dxa"/>
-              <w:bottom w:w="80" w:type="dxa"/>
-              <w:left w:w="120" w:type="dxa"/>
-              <w:right w:w="120" w:type="dxa"/>
-            </w:tcMar>
-            <w:shd w:fill="FFFFFF"/>
-          </w:tcPr>
-          <w:p>
-            <w:r>
-              <w:rPr>
-                <w:b/>
-              </w:rPr>
-              <w:t>2. Giới hạn số lần sửa</w:t>
-            </w:r>
-          </w:p>
-        </w:tc>
-        <w:tc>
-          <w:tcPr>
-            <w:tcW w:type="dxa" w:w="7200"/>
-            <w:tcMar>
-              <w:top w:w="80" w:type="dxa"/>
-              <w:bottom w:w="80" w:type="dxa"/>
-              <w:left w:w="120" w:type="dxa"/>
-              <w:right w:w="120" w:type="dxa"/>
-            </w:tcMar>
-            <w:shd w:fill="FFFFFF"/>
-          </w:tcPr>
-          <w:p>
-            <w:r>
-              <w:t>Mỗi bài viết tối đa 02 lần chỉnh sửa theo quy định. Thầy/Cô vui lòng đọc kỹ góp ý của BTT để bổ sung trọn vẹn trong 1 lần.</w:t>
-            </w:r>
-          </w:p>
-        </w:tc>
-      </w:tr>
-      <w:tr>
-        <w:tc>
-          <w:tcPr>
-            <w:tcW w:type="dxa" w:w="3168"/>
-            <w:tcMar>
-              <w:top w:w="80" w:type="dxa"/>
-              <w:bottom w:w="80" w:type="dxa"/>
-              <w:left w:w="120" w:type="dxa"/>
-              <w:right w:w="120" w:type="dxa"/>
-            </w:tcMar>
-            <w:shd w:fill="F8FAFC"/>
-          </w:tcPr>
-          <w:p>
-            <w:r>
-              <w:rPr>
-                <w:b/>
-              </w:rPr>
-              <w:t>3. Chất lượng hình ảnh</w:t>
-            </w:r>
-          </w:p>
-        </w:tc>
-        <w:tc>
-          <w:tcPr>
-            <w:tcW w:type="dxa" w:w="7200"/>
-            <w:tcMar>
-              <w:top w:w="80" w:type="dxa"/>
-              <w:bottom w:w="80" w:type="dxa"/>
-              <w:left w:w="120" w:type="dxa"/>
-              <w:right w:w="120" w:type="dxa"/>
-            </w:tcMar>
-            <w:shd w:fill="F8FAFC"/>
-          </w:tcPr>
-          <w:p>
-            <w:r>
-              <w:t>Gửi file ảnh gốc sắc nét (không gửi ảnh đã qua nén vỡ hình của Zalo/Messenger thông thường). Đảm bảo góc máy trang nghiêm, tác phong chuẩn mực sư phạm.</w:t>
-            </w:r>
-          </w:p>
-        </w:tc>
-      </w:tr>
-    </w:tbl>
-    <w:p>
-      <w:pPr>
-        <w:spacing w:before="280" w:after="80"/>
-      </w:pPr>
-      <w:r>
-        <w:rPr>
-          <w:b/>
-          <w:color w:val="0F3E6D"/>
-          <w:sz w:val="26"/>
-        </w:rPr>
-        <w:t>V. THÔNG TIN HỖ TRỢ KỸ THUẬT</w:t>
-      </w:r>
-    </w:p>
-    <w:p>
-      <w:r>
-        <w:t>Trong quá trình thao tác tải tệp hoặc tra cứu bài viết, nếu gặp sự cố kỹ thuật hoặc cần hỗ trợ gấp, Quý Thầy/Cô vui lòng liên hệ:</w:t>
-        <w:br/>
-      </w:r>
-      <w:r>
-        <w:rPr>
-          <w:b/>
-        </w:rPr>
-        <w:t xml:space="preserve">• Thầy Nguyễn Hồ Trọng Tín </w:t>
-      </w:r>
-      <w:r>
-        <w:t>(Tổ Tin học – Phụ trách Kỹ thuật &amp; Quản trị Hệ thống BTT)</w:t>
-        <w:br/>
-      </w:r>
-      <w:r>
-        <w:rPr>
-          <w:b/>
-        </w:rPr>
-        <w:t xml:space="preserve">• Thầy Nguyễn Huỳnh Trọng Phúc </w:t>
-      </w:r>
-      <w:r>
-        <w:t>(Tổ Tin học – Hỗ trợ Kỹ thuật BTT)</w:t>
-        <w:br/>
-      </w:r>
-      <w:r>
-        <w:rPr>
-          <w:b/>
-        </w:rPr>
-        <w:t xml:space="preserve">• Nhóm Zalo: </w:t>
-      </w:r>
-      <w:r>
-        <w:t>Hội đồng Sư phạm THPT Mạc Đĩnh Chi / Kênh Truyền Thông BTT</w:t>
-      </w:r>
-    </w:p>
-    <w:p>
-      <w:pPr>
-        <w:spacing w:before="200" w:after="80"/>
-      </w:pPr>
-    </w:p>
-    <w:tbl>
-      <w:tblPr>
-        <w:tblW w:type="auto" w:w="0"/>
-        <w:jc w:val="center"/>
-        <w:tblLook w:firstColumn="1" w:firstRow="1" w:lastColumn="0" w:lastRow="0" w:noHBand="0" w:noVBand="1" w:val="04A0"/>
-      </w:tblPr>
-      <w:tblGrid>
-        <w:gridCol w:w="4802"/>
-        <w:gridCol w:w="4802"/>
-      </w:tblGrid>
-      <w:tr>
-        <w:tc>
-          <w:tcPr>
-            <w:tcW w:type="dxa" w:w="5184"/>
-          </w:tcPr>
-          <w:p>
-            <w:pPr>
-              <w:jc w:val="center"/>
-            </w:pPr>
-            <w:r>
-              <w:rPr>
-                <w:b/>
-              </w:rPr>
-              <w:t>BỘ PHẬN KỸ THUẬT BTT</w:t>
-              <w:br/>
-            </w:r>
-            <w:r>
-              <w:rPr>
-                <w:i/>
-              </w:rPr>
-              <w:t>(Đã ký và triển khai hệ thống)</w:t>
-              <w:br/>
-              <w:br/>
-              <w:br/>
-            </w:r>
-            <w:r>
-              <w:rPr>
-                <w:b/>
-              </w:rPr>
-              <w:t>Thầy Nguyễn Hồ Trọng Tín</w:t>
-            </w:r>
-          </w:p>
-        </w:tc>
-        <w:tc>
-          <w:tcPr>
-            <w:tcW w:type="dxa" w:w="5184"/>
-          </w:tcPr>
-          <w:p>
-            <w:pPr>
-              <w:jc w:val="center"/>
-            </w:pPr>
-            <w:r>
-              <w:rPr>
-                <w:b/>
-              </w:rPr>
-              <w:t>TRƯỞNG BAN TRUYỀN THÔNG</w:t>
-              <w:br/>
-            </w:r>
-            <w:r>
-              <w:rPr>
-                <w:i/>
-              </w:rPr>
-              <w:t>(Phê duyệt lưu hành)</w:t>
-              <w:br/>
-              <w:br/>
-              <w:br/>
-            </w:r>
-            <w:r>
-              <w:rPr>
-                <w:b/>
-              </w:rPr>
-              <w:t>Thầy Đoàn Huỳnh Xuân Tưởng</w:t>
-              <w:br/>
-              <w:t>(Phó Hiệu trưởng)</w:t>
-            </w:r>
-          </w:p>
-        </w:tc>
-      </w:tr>
-    </w:tbl>
     <w:sectPr>
       <w:pgSz w:w="11909" w:h="16834"/>
       <w:pgMar w:top="1152" w:right="1152" w:bottom="1152" w:left="1152" w:header="720" w:footer="720" w:gutter="0"/>
@@ -1584,9 +1390,9 @@
       <w:spacing w:line="300" w:lineRule="auto" w:after="80"/>
     </w:pPr>
     <w:rPr>
-      <w:rFonts w:ascii="Times New Roman" w:hAnsi="Times New Roman"/>
+      <w:rFonts w:ascii="Arial" w:hAnsi="Arial"/>
       <w:color w:val="1E293B"/>
-      <w:sz w:val="24"/>
+      <w:sz w:val="22"/>
     </w:rPr>
   </w:style>
   <w:style w:type="paragraph" w:styleId="Header">

</xml_diff>